<commit_message>
Ajuste de configuracion de pie de pagina y cabezales en la seccion de configuracion word
</commit_message>
<xml_diff>
--- a/src-electron/TemplateBautismo.docx
+++ b/src-electron/TemplateBautismo.docx
@@ -211,21 +211,7 @@
               <w:rPr>
                 <w:sz w:val="20"/>
               </w:rPr>
-              <w:t>{</w:t>
-            </w:r>
-            <w:proofErr w:type="spellStart"/>
-            <w:r>
-              <w:rPr>
-                <w:sz w:val="20"/>
-              </w:rPr>
-              <w:t>Fecha_Bautismo</w:t>
-            </w:r>
-            <w:proofErr w:type="spellEnd"/>
-            <w:r>
-              <w:rPr>
-                <w:sz w:val="20"/>
-              </w:rPr>
-              <w:t>}</w:t>
+              <w:t>{Fecha_Bautismo}</w:t>
             </w:r>
           </w:p>
         </w:tc>
@@ -393,21 +379,7 @@
               <w:rPr>
                 <w:sz w:val="20"/>
               </w:rPr>
-              <w:t>{</w:t>
-            </w:r>
-            <w:proofErr w:type="spellStart"/>
-            <w:r>
-              <w:rPr>
-                <w:sz w:val="20"/>
-              </w:rPr>
-              <w:t>Lugar_Nacimiento</w:t>
-            </w:r>
-            <w:proofErr w:type="spellEnd"/>
-            <w:r>
-              <w:rPr>
-                <w:sz w:val="20"/>
-              </w:rPr>
-              <w:t>}</w:t>
+              <w:t>{Lugar_Nacimiento}</w:t>
             </w:r>
           </w:p>
         </w:tc>
@@ -463,21 +435,7 @@
               <w:rPr>
                 <w:sz w:val="20"/>
               </w:rPr>
-              <w:t>{</w:t>
-            </w:r>
-            <w:proofErr w:type="spellStart"/>
-            <w:r>
-              <w:rPr>
-                <w:sz w:val="20"/>
-              </w:rPr>
-              <w:t>Fecha_Nacimiento</w:t>
-            </w:r>
-            <w:proofErr w:type="spellEnd"/>
-            <w:r>
-              <w:rPr>
-                <w:sz w:val="20"/>
-              </w:rPr>
-              <w:t>}</w:t>
+              <w:t>{Fecha_Nacimiento}</w:t>
             </w:r>
           </w:p>
         </w:tc>
@@ -589,21 +547,7 @@
               <w:rPr>
                 <w:sz w:val="20"/>
               </w:rPr>
-              <w:t>{</w:t>
-            </w:r>
-            <w:proofErr w:type="spellStart"/>
-            <w:r>
-              <w:rPr>
-                <w:sz w:val="20"/>
-              </w:rPr>
-              <w:t>Abuelos_Paternos</w:t>
-            </w:r>
-            <w:proofErr w:type="spellEnd"/>
-            <w:r>
-              <w:rPr>
-                <w:sz w:val="20"/>
-              </w:rPr>
-              <w:t>}</w:t>
+              <w:t>{Abuelos_Paternos}</w:t>
             </w:r>
           </w:p>
         </w:tc>
@@ -659,21 +603,7 @@
               <w:rPr>
                 <w:sz w:val="20"/>
               </w:rPr>
-              <w:t>{</w:t>
-            </w:r>
-            <w:proofErr w:type="spellStart"/>
-            <w:r>
-              <w:rPr>
-                <w:sz w:val="20"/>
-              </w:rPr>
-              <w:t>Abuelos_Maternos</w:t>
-            </w:r>
-            <w:proofErr w:type="spellEnd"/>
-            <w:r>
-              <w:rPr>
-                <w:sz w:val="20"/>
-              </w:rPr>
-              <w:t>}</w:t>
+              <w:t>{Abuelos_Maternos}</w:t>
             </w:r>
           </w:p>
         </w:tc>
@@ -785,21 +715,7 @@
               <w:rPr>
                 <w:sz w:val="20"/>
               </w:rPr>
-              <w:t>{</w:t>
-            </w:r>
-            <w:proofErr w:type="spellStart"/>
-            <w:r>
-              <w:rPr>
-                <w:sz w:val="20"/>
-              </w:rPr>
-              <w:t>DoyFe</w:t>
-            </w:r>
-            <w:proofErr w:type="spellEnd"/>
-            <w:r>
-              <w:rPr>
-                <w:sz w:val="20"/>
-              </w:rPr>
-              <w:t>}</w:t>
+              <w:t>{DoyFe}</w:t>
             </w:r>
           </w:p>
         </w:tc>
@@ -855,21 +771,7 @@
               <w:rPr>
                 <w:sz w:val="20"/>
               </w:rPr>
-              <w:t>{</w:t>
-            </w:r>
-            <w:proofErr w:type="spellStart"/>
-            <w:r>
-              <w:rPr>
-                <w:sz w:val="20"/>
-              </w:rPr>
-              <w:t>Nota_Marginal</w:t>
-            </w:r>
-            <w:proofErr w:type="spellEnd"/>
-            <w:r>
-              <w:rPr>
-                <w:sz w:val="20"/>
-              </w:rPr>
-              <w:t>}</w:t>
+              <w:t>{Nota_Marginal}</w:t>
             </w:r>
           </w:p>
         </w:tc>
@@ -908,7 +810,6 @@
               </w:rPr>
               <w:t>{</w:t>
             </w:r>
-            <w:proofErr w:type="spellStart"/>
             <w:r>
               <w:rPr>
                 <w:rFonts w:hAnsi="Arial"/>
@@ -936,7 +837,6 @@
               </w:rPr>
               <w:t>didaEn</w:t>
             </w:r>
-            <w:proofErr w:type="spellEnd"/>
             <w:r>
               <w:rPr>
                 <w:rFonts w:hAnsi="Arial"/>
@@ -1046,8 +946,12 @@
     </w:tbl>
     <w:p/>
     <w:sectPr>
-      <w:headerReference w:type="default" r:id="rId6"/>
-      <w:footerReference w:type="default" r:id="rId7"/>
+      <w:headerReference w:type="even" r:id="rId6"/>
+      <w:headerReference w:type="default" r:id="rId7"/>
+      <w:footerReference w:type="even" r:id="rId8"/>
+      <w:footerReference w:type="default" r:id="rId9"/>
+      <w:headerReference w:type="first" r:id="rId10"/>
+      <w:footerReference w:type="first" r:id="rId11"/>
       <w:pgSz w:w="11907" w:h="18654"/>
       <w:pgMar w:top="0" w:right="907" w:bottom="0" w:left="1134" w:header="567" w:footer="283" w:gutter="0"/>
       <w:cols w:space="720"/>
@@ -1085,6 +989,16 @@
 <w:ftr xmlns:wpc="http://schemas.microsoft.com/office/word/2010/wordprocessingCanvas" xmlns:cx="http://schemas.microsoft.com/office/drawing/2014/chartex" xmlns:cx1="http://schemas.microsoft.com/office/drawing/2015/9/8/chartex" xmlns:cx2="http://schemas.microsoft.com/office/drawing/2015/10/21/chartex" xmlns:cx3="http://schemas.microsoft.com/office/drawing/2016/5/9/chartex" xmlns:cx4="http://schemas.microsoft.com/office/drawing/2016/5/10/chartex" xmlns:cx5="http://schemas.microsoft.com/office/drawing/2016/5/11/chartex" xmlns:cx6="http://schemas.microsoft.com/office/drawing/2016/5/12/chartex" xmlns:cx7="http://schemas.microsoft.com/office/drawing/2016/5/13/chartex" xmlns:cx8="http://schemas.microsoft.com/office/drawing/2016/5/14/chartex" xmlns:mc="http://schemas.openxmlformats.org/markup-compatibility/2006" xmlns:aink="http://schemas.microsoft.com/office/drawing/2016/ink" xmlns:am3d="http://schemas.microsoft.com/office/drawing/2017/model3d" xmlns:o="urn:schemas-microsoft-com:office:office" xmlns:oel="http://schemas.microsoft.com/office/2019/extlst" xmlns:r="http://schemas.openxmlformats.org/officeDocument/2006/relationships" xmlns:m="http://schemas.openxmlformats.org/officeDocument/2006/math" xmlns:v="urn:schemas-microsoft-com:vml" xmlns:wp14="http://schemas.microsoft.com/office/word/2010/wordprocessingDrawing" xmlns:wp="http://schemas.openxmlformats.org/drawingml/2006/wordprocessingDrawing" xmlns:w10="urn:schemas-microsoft-com:office:word" xmlns:w="http://schemas.openxmlformats.org/wordprocessingml/2006/main" xmlns:w14="http://schemas.microsoft.com/office/word/2010/wordml" xmlns:w15="http://schemas.microsoft.com/office/word/2012/wordml" xmlns:w16cex="http://schemas.microsoft.com/office/word/2018/wordml/cex" xmlns:w16cid="http://schemas.microsoft.com/office/word/2016/wordml/cid" xmlns:w16="http://schemas.microsoft.com/office/word/2018/wordml" xmlns:w16sdtdh="http://schemas.microsoft.com/office/word/2020/wordml/sdtdatahash" xmlns:w16se="http://schemas.microsoft.com/office/word/2015/wordml/symex" xmlns:wpg="http://schemas.microsoft.com/office/word/2010/wordprocessingGroup" xmlns:wpi="http://schemas.microsoft.com/office/word/2010/wordprocessingInk" xmlns:wne="http://schemas.microsoft.com/office/word/2006/wordml" xmlns:wps="http://schemas.microsoft.com/office/word/2010/wordprocessingShape" mc:Ignorable="w14 w15 w16se w16cid w16 w16cex w16sdtdh wp14">
   <w:p>
     <w:pPr>
+      <w:pStyle w:val="Piedepgina"/>
+    </w:pPr>
+  </w:p>
+</w:ftr>
+</file>
+
+<file path=word/footer2.xml><?xml version="1.0" encoding="utf-8"?>
+<w:ftr xmlns:wpc="http://schemas.microsoft.com/office/word/2010/wordprocessingCanvas" xmlns:cx="http://schemas.microsoft.com/office/drawing/2014/chartex" xmlns:cx1="http://schemas.microsoft.com/office/drawing/2015/9/8/chartex" xmlns:cx2="http://schemas.microsoft.com/office/drawing/2015/10/21/chartex" xmlns:cx3="http://schemas.microsoft.com/office/drawing/2016/5/9/chartex" xmlns:cx4="http://schemas.microsoft.com/office/drawing/2016/5/10/chartex" xmlns:cx5="http://schemas.microsoft.com/office/drawing/2016/5/11/chartex" xmlns:cx6="http://schemas.microsoft.com/office/drawing/2016/5/12/chartex" xmlns:cx7="http://schemas.microsoft.com/office/drawing/2016/5/13/chartex" xmlns:cx8="http://schemas.microsoft.com/office/drawing/2016/5/14/chartex" xmlns:mc="http://schemas.openxmlformats.org/markup-compatibility/2006" xmlns:aink="http://schemas.microsoft.com/office/drawing/2016/ink" xmlns:am3d="http://schemas.microsoft.com/office/drawing/2017/model3d" xmlns:o="urn:schemas-microsoft-com:office:office" xmlns:oel="http://schemas.microsoft.com/office/2019/extlst" xmlns:r="http://schemas.openxmlformats.org/officeDocument/2006/relationships" xmlns:m="http://schemas.openxmlformats.org/officeDocument/2006/math" xmlns:v="urn:schemas-microsoft-com:vml" xmlns:wp14="http://schemas.microsoft.com/office/word/2010/wordprocessingDrawing" xmlns:wp="http://schemas.openxmlformats.org/drawingml/2006/wordprocessingDrawing" xmlns:w10="urn:schemas-microsoft-com:office:word" xmlns:w="http://schemas.openxmlformats.org/wordprocessingml/2006/main" xmlns:w14="http://schemas.microsoft.com/office/word/2010/wordml" xmlns:w15="http://schemas.microsoft.com/office/word/2012/wordml" xmlns:w16cex="http://schemas.microsoft.com/office/word/2018/wordml/cex" xmlns:w16cid="http://schemas.microsoft.com/office/word/2016/wordml/cid" xmlns:w16="http://schemas.microsoft.com/office/word/2018/wordml" xmlns:w16sdtdh="http://schemas.microsoft.com/office/word/2020/wordml/sdtdatahash" xmlns:w16se="http://schemas.microsoft.com/office/word/2015/wordml/symex" xmlns:wpg="http://schemas.microsoft.com/office/word/2010/wordprocessingGroup" xmlns:wpi="http://schemas.microsoft.com/office/word/2010/wordprocessingInk" xmlns:wne="http://schemas.microsoft.com/office/word/2006/wordml" xmlns:wps="http://schemas.microsoft.com/office/word/2010/wordprocessingShape" mc:Ignorable="w14 w15 w16se w16cid w16 w16cex w16sdtdh wp14">
+  <w:p>
+    <w:pPr>
       <w:spacing w:line="240" w:lineRule="auto"/>
       <w:jc w:val="center"/>
     </w:pPr>
@@ -1104,7 +1018,19 @@
       <w:rPr>
         <w:rFonts w:hAnsi="Arial"/>
       </w:rPr>
-      <w:t xml:space="preserve"> Autenticación en la curia Diocesana de Fontibón, Carrera 98 # 17 A - 81 Fontibón - Centro.</w:t>
+      <w:t xml:space="preserve"> Autenticación en la curia Diocesana de Fontibón, Carrera 9</w:t>
+    </w:r>
+    <w:r>
+      <w:rPr>
+        <w:rFonts w:hAnsi="Arial"/>
+      </w:rPr>
+      <w:t>8</w:t>
+    </w:r>
+    <w:r>
+      <w:rPr>
+        <w:rFonts w:hAnsi="Arial"/>
+      </w:rPr>
+      <w:t xml:space="preserve"> # 17 A - 81 Fontibón - Centro.</w:t>
     </w:r>
   </w:p>
   <w:p>
@@ -1118,6 +1044,16 @@
       </w:rPr>
       <w:t xml:space="preserve"> Tel (601)4181036, Horario de atención, Lunes a Viernes de 9:00 a 1:00 P.M. (Validez a 3 Meses)</w:t>
     </w:r>
+  </w:p>
+</w:ftr>
+</file>
+
+<file path=word/footer3.xml><?xml version="1.0" encoding="utf-8"?>
+<w:ftr xmlns:wpc="http://schemas.microsoft.com/office/word/2010/wordprocessingCanvas" xmlns:cx="http://schemas.microsoft.com/office/drawing/2014/chartex" xmlns:cx1="http://schemas.microsoft.com/office/drawing/2015/9/8/chartex" xmlns:cx2="http://schemas.microsoft.com/office/drawing/2015/10/21/chartex" xmlns:cx3="http://schemas.microsoft.com/office/drawing/2016/5/9/chartex" xmlns:cx4="http://schemas.microsoft.com/office/drawing/2016/5/10/chartex" xmlns:cx5="http://schemas.microsoft.com/office/drawing/2016/5/11/chartex" xmlns:cx6="http://schemas.microsoft.com/office/drawing/2016/5/12/chartex" xmlns:cx7="http://schemas.microsoft.com/office/drawing/2016/5/13/chartex" xmlns:cx8="http://schemas.microsoft.com/office/drawing/2016/5/14/chartex" xmlns:mc="http://schemas.openxmlformats.org/markup-compatibility/2006" xmlns:aink="http://schemas.microsoft.com/office/drawing/2016/ink" xmlns:am3d="http://schemas.microsoft.com/office/drawing/2017/model3d" xmlns:o="urn:schemas-microsoft-com:office:office" xmlns:oel="http://schemas.microsoft.com/office/2019/extlst" xmlns:r="http://schemas.openxmlformats.org/officeDocument/2006/relationships" xmlns:m="http://schemas.openxmlformats.org/officeDocument/2006/math" xmlns:v="urn:schemas-microsoft-com:vml" xmlns:wp14="http://schemas.microsoft.com/office/word/2010/wordprocessingDrawing" xmlns:wp="http://schemas.openxmlformats.org/drawingml/2006/wordprocessingDrawing" xmlns:w10="urn:schemas-microsoft-com:office:word" xmlns:w="http://schemas.openxmlformats.org/wordprocessingml/2006/main" xmlns:w14="http://schemas.microsoft.com/office/word/2010/wordml" xmlns:w15="http://schemas.microsoft.com/office/word/2012/wordml" xmlns:w16cex="http://schemas.microsoft.com/office/word/2018/wordml/cex" xmlns:w16cid="http://schemas.microsoft.com/office/word/2016/wordml/cid" xmlns:w16="http://schemas.microsoft.com/office/word/2018/wordml" xmlns:w16sdtdh="http://schemas.microsoft.com/office/word/2020/wordml/sdtdatahash" xmlns:w16se="http://schemas.microsoft.com/office/word/2015/wordml/symex" xmlns:wpg="http://schemas.microsoft.com/office/word/2010/wordprocessingGroup" xmlns:wpi="http://schemas.microsoft.com/office/word/2010/wordprocessingInk" xmlns:wne="http://schemas.microsoft.com/office/word/2006/wordml" xmlns:wps="http://schemas.microsoft.com/office/word/2010/wordprocessingShape" mc:Ignorable="w14 w15 w16se w16cid w16 w16cex w16sdtdh wp14">
+  <w:p>
+    <w:pPr>
+      <w:pStyle w:val="Piedepgina"/>
+    </w:pPr>
   </w:p>
 </w:ftr>
 </file>
@@ -1148,6 +1084,16 @@
 </file>
 
 <file path=word/header1.xml><?xml version="1.0" encoding="utf-8"?>
+<w:hdr xmlns:wpc="http://schemas.microsoft.com/office/word/2010/wordprocessingCanvas" xmlns:cx="http://schemas.microsoft.com/office/drawing/2014/chartex" xmlns:cx1="http://schemas.microsoft.com/office/drawing/2015/9/8/chartex" xmlns:cx2="http://schemas.microsoft.com/office/drawing/2015/10/21/chartex" xmlns:cx3="http://schemas.microsoft.com/office/drawing/2016/5/9/chartex" xmlns:cx4="http://schemas.microsoft.com/office/drawing/2016/5/10/chartex" xmlns:cx5="http://schemas.microsoft.com/office/drawing/2016/5/11/chartex" xmlns:cx6="http://schemas.microsoft.com/office/drawing/2016/5/12/chartex" xmlns:cx7="http://schemas.microsoft.com/office/drawing/2016/5/13/chartex" xmlns:cx8="http://schemas.microsoft.com/office/drawing/2016/5/14/chartex" xmlns:mc="http://schemas.openxmlformats.org/markup-compatibility/2006" xmlns:aink="http://schemas.microsoft.com/office/drawing/2016/ink" xmlns:am3d="http://schemas.microsoft.com/office/drawing/2017/model3d" xmlns:o="urn:schemas-microsoft-com:office:office" xmlns:oel="http://schemas.microsoft.com/office/2019/extlst" xmlns:r="http://schemas.openxmlformats.org/officeDocument/2006/relationships" xmlns:m="http://schemas.openxmlformats.org/officeDocument/2006/math" xmlns:v="urn:schemas-microsoft-com:vml" xmlns:wp14="http://schemas.microsoft.com/office/word/2010/wordprocessingDrawing" xmlns:wp="http://schemas.openxmlformats.org/drawingml/2006/wordprocessingDrawing" xmlns:w10="urn:schemas-microsoft-com:office:word" xmlns:w="http://schemas.openxmlformats.org/wordprocessingml/2006/main" xmlns:w14="http://schemas.microsoft.com/office/word/2010/wordml" xmlns:w15="http://schemas.microsoft.com/office/word/2012/wordml" xmlns:w16cex="http://schemas.microsoft.com/office/word/2018/wordml/cex" xmlns:w16cid="http://schemas.microsoft.com/office/word/2016/wordml/cid" xmlns:w16="http://schemas.microsoft.com/office/word/2018/wordml" xmlns:w16sdtdh="http://schemas.microsoft.com/office/word/2020/wordml/sdtdatahash" xmlns:w16se="http://schemas.microsoft.com/office/word/2015/wordml/symex" xmlns:wpg="http://schemas.microsoft.com/office/word/2010/wordprocessingGroup" xmlns:wpi="http://schemas.microsoft.com/office/word/2010/wordprocessingInk" xmlns:wne="http://schemas.microsoft.com/office/word/2006/wordml" xmlns:wps="http://schemas.microsoft.com/office/word/2010/wordprocessingShape" mc:Ignorable="w14 w15 w16se w16cid w16 w16cex w16sdtdh wp14">
+  <w:p>
+    <w:pPr>
+      <w:pStyle w:val="Encabezado"/>
+    </w:pPr>
+  </w:p>
+</w:hdr>
+</file>
+
+<file path=word/header2.xml><?xml version="1.0" encoding="utf-8"?>
 <w:hdr xmlns:wpc="http://schemas.microsoft.com/office/word/2010/wordprocessingCanvas" xmlns:cx="http://schemas.microsoft.com/office/drawing/2014/chartex" xmlns:cx1="http://schemas.microsoft.com/office/drawing/2015/9/8/chartex" xmlns:cx2="http://schemas.microsoft.com/office/drawing/2015/10/21/chartex" xmlns:cx3="http://schemas.microsoft.com/office/drawing/2016/5/9/chartex" xmlns:cx4="http://schemas.microsoft.com/office/drawing/2016/5/10/chartex" xmlns:cx5="http://schemas.microsoft.com/office/drawing/2016/5/11/chartex" xmlns:cx6="http://schemas.microsoft.com/office/drawing/2016/5/12/chartex" xmlns:cx7="http://schemas.microsoft.com/office/drawing/2016/5/13/chartex" xmlns:cx8="http://schemas.microsoft.com/office/drawing/2016/5/14/chartex" xmlns:mc="http://schemas.openxmlformats.org/markup-compatibility/2006" xmlns:aink="http://schemas.microsoft.com/office/drawing/2016/ink" xmlns:am3d="http://schemas.microsoft.com/office/drawing/2017/model3d" xmlns:o="urn:schemas-microsoft-com:office:office" xmlns:oel="http://schemas.microsoft.com/office/2019/extlst" xmlns:r="http://schemas.openxmlformats.org/officeDocument/2006/relationships" xmlns:m="http://schemas.openxmlformats.org/officeDocument/2006/math" xmlns:v="urn:schemas-microsoft-com:vml" xmlns:wp14="http://schemas.microsoft.com/office/word/2010/wordprocessingDrawing" xmlns:wp="http://schemas.openxmlformats.org/drawingml/2006/wordprocessingDrawing" xmlns:w10="urn:schemas-microsoft-com:office:word" xmlns:w="http://schemas.openxmlformats.org/wordprocessingml/2006/main" xmlns:w14="http://schemas.microsoft.com/office/word/2010/wordml" xmlns:w15="http://schemas.microsoft.com/office/word/2012/wordml" xmlns:w16cex="http://schemas.microsoft.com/office/word/2018/wordml/cex" xmlns:w16cid="http://schemas.microsoft.com/office/word/2016/wordml/cid" xmlns:w16="http://schemas.microsoft.com/office/word/2018/wordml" xmlns:w16sdtdh="http://schemas.microsoft.com/office/word/2020/wordml/sdtdatahash" xmlns:w16se="http://schemas.microsoft.com/office/word/2015/wordml/symex" xmlns:wpg="http://schemas.microsoft.com/office/word/2010/wordprocessingGroup" xmlns:wpi="http://schemas.microsoft.com/office/word/2010/wordprocessingInk" xmlns:wne="http://schemas.microsoft.com/office/word/2006/wordml" xmlns:wps="http://schemas.microsoft.com/office/word/2010/wordprocessingShape" mc:Ignorable="w14 w15 w16se w16cid w16 w16cex w16sdtdh wp14">
   <w:p>
     <w:pPr>
@@ -1202,6 +1148,16 @@
     </w:r>
   </w:p>
   <w:p/>
+</w:hdr>
+</file>
+
+<file path=word/header3.xml><?xml version="1.0" encoding="utf-8"?>
+<w:hdr xmlns:wpc="http://schemas.microsoft.com/office/word/2010/wordprocessingCanvas" xmlns:cx="http://schemas.microsoft.com/office/drawing/2014/chartex" xmlns:cx1="http://schemas.microsoft.com/office/drawing/2015/9/8/chartex" xmlns:cx2="http://schemas.microsoft.com/office/drawing/2015/10/21/chartex" xmlns:cx3="http://schemas.microsoft.com/office/drawing/2016/5/9/chartex" xmlns:cx4="http://schemas.microsoft.com/office/drawing/2016/5/10/chartex" xmlns:cx5="http://schemas.microsoft.com/office/drawing/2016/5/11/chartex" xmlns:cx6="http://schemas.microsoft.com/office/drawing/2016/5/12/chartex" xmlns:cx7="http://schemas.microsoft.com/office/drawing/2016/5/13/chartex" xmlns:cx8="http://schemas.microsoft.com/office/drawing/2016/5/14/chartex" xmlns:mc="http://schemas.openxmlformats.org/markup-compatibility/2006" xmlns:aink="http://schemas.microsoft.com/office/drawing/2016/ink" xmlns:am3d="http://schemas.microsoft.com/office/drawing/2017/model3d" xmlns:o="urn:schemas-microsoft-com:office:office" xmlns:oel="http://schemas.microsoft.com/office/2019/extlst" xmlns:r="http://schemas.openxmlformats.org/officeDocument/2006/relationships" xmlns:m="http://schemas.openxmlformats.org/officeDocument/2006/math" xmlns:v="urn:schemas-microsoft-com:vml" xmlns:wp14="http://schemas.microsoft.com/office/word/2010/wordprocessingDrawing" xmlns:wp="http://schemas.openxmlformats.org/drawingml/2006/wordprocessingDrawing" xmlns:w10="urn:schemas-microsoft-com:office:word" xmlns:w="http://schemas.openxmlformats.org/wordprocessingml/2006/main" xmlns:w14="http://schemas.microsoft.com/office/word/2010/wordml" xmlns:w15="http://schemas.microsoft.com/office/word/2012/wordml" xmlns:w16cex="http://schemas.microsoft.com/office/word/2018/wordml/cex" xmlns:w16cid="http://schemas.microsoft.com/office/word/2016/wordml/cid" xmlns:w16="http://schemas.microsoft.com/office/word/2018/wordml" xmlns:w16sdtdh="http://schemas.microsoft.com/office/word/2020/wordml/sdtdatahash" xmlns:w16se="http://schemas.microsoft.com/office/word/2015/wordml/symex" xmlns:wpg="http://schemas.microsoft.com/office/word/2010/wordprocessingGroup" xmlns:wpi="http://schemas.microsoft.com/office/word/2010/wordprocessingInk" xmlns:wne="http://schemas.microsoft.com/office/word/2006/wordml" xmlns:wps="http://schemas.microsoft.com/office/word/2010/wordprocessingShape" mc:Ignorable="w14 w15 w16se w16cid w16 w16cex w16sdtdh wp14">
+  <w:p>
+    <w:pPr>
+      <w:pStyle w:val="Encabezado"/>
+    </w:pPr>
+  </w:p>
 </w:hdr>
 </file>
 

</xml_diff>